<commit_message>
Completion of LabModule 8
</commit_message>
<xml_diff>
--- a/LabModule8/CSF3133LabModule8.docx
+++ b/LabModule8/CSF3133LabModule8.docx
@@ -119,7 +119,7 @@
           <w:sz w:val="52"/>
           <w:szCs w:val="24"/>
         </w:rPr>
-        <w:t>7</w:t>
+        <w:t>8</w:t>
       </w:r>
     </w:p>
     <w:p>
@@ -455,15 +455,7 @@
       </w:pPr>
       <w:r>
         <w:lastRenderedPageBreak/>
-        <w:t xml:space="preserve">8.5.4 Text </w:t>
-      </w:r>
-      <w:proofErr w:type="spellStart"/>
-      <w:r>
-        <w:t>Color</w:t>
-      </w:r>
-      <w:proofErr w:type="spellEnd"/>
-      <w:r>
-        <w:t xml:space="preserve"> and Background</w:t>
+        <w:t>8.5.4 Text Color and Background</w:t>
       </w:r>
     </w:p>
     <w:p>
@@ -1219,6 +1211,9 @@
     </w:p>
     <w:p>
       <w:r>
+        <w:rPr>
+          <w:noProof/>
+        </w:rPr>
         <w:drawing>
           <wp:inline distT="0" distB="0" distL="0" distR="0" wp14:anchorId="5B84327F" wp14:editId="73F35B34">
             <wp:extent cx="2572109" cy="1467055"/>
@@ -1267,6 +1262,9 @@
     </w:p>
     <w:p>
       <w:r>
+        <w:rPr>
+          <w:noProof/>
+        </w:rPr>
         <w:drawing>
           <wp:inline distT="0" distB="0" distL="0" distR="0" wp14:anchorId="5E31162A" wp14:editId="3AB83D4D">
             <wp:extent cx="3772426" cy="504895"/>
@@ -1315,6 +1313,9 @@
     </w:p>
     <w:p>
       <w:r>
+        <w:rPr>
+          <w:noProof/>
+        </w:rPr>
         <w:drawing>
           <wp:inline distT="0" distB="0" distL="0" distR="0" wp14:anchorId="612A771D" wp14:editId="6EDE40AB">
             <wp:extent cx="2972215" cy="800212"/>
@@ -1363,6 +1364,9 @@
     </w:p>
     <w:p>
       <w:r>
+        <w:rPr>
+          <w:noProof/>
+        </w:rPr>
         <w:drawing>
           <wp:inline distT="0" distB="0" distL="0" distR="0" wp14:anchorId="331C48CB" wp14:editId="1E2E5F6B">
             <wp:extent cx="3067478" cy="809738"/>
@@ -1419,6 +1423,9 @@
     </w:p>
     <w:p>
       <w:r>
+        <w:rPr>
+          <w:noProof/>
+        </w:rPr>
         <w:drawing>
           <wp:inline distT="0" distB="0" distL="0" distR="0" wp14:anchorId="3FBD87C0" wp14:editId="580E57C2">
             <wp:extent cx="5430008" cy="2972215"/>
@@ -1470,20 +1477,95 @@
       </w:pPr>
       <w:r>
         <w:lastRenderedPageBreak/>
-        <w:t xml:space="preserve">8.7 Using </w:t>
-      </w:r>
-      <w:proofErr w:type="spellStart"/>
-      <w:r>
-        <w:t>BootStrap</w:t>
-      </w:r>
-      <w:proofErr w:type="spellEnd"/>
-      <w:r>
-        <w:t xml:space="preserve"> Theme</w:t>
+        <w:t>8.7 Using BootStrap Theme</w:t>
+      </w:r>
+    </w:p>
+    <w:p>
+      <w:r>
+        <w:rPr>
+          <w:noProof/>
+        </w:rPr>
+        <w:drawing>
+          <wp:inline distT="0" distB="0" distL="0" distR="0" wp14:anchorId="46FE93C2" wp14:editId="278D80F9">
+            <wp:extent cx="5731510" cy="3801110"/>
+            <wp:effectExtent l="0" t="0" r="2540" b="8890"/>
+            <wp:docPr id="901112504" name="Picture 1" descr="A screen shot of a computer program&#10;&#10;AI-generated content may be incorrect."/>
+            <wp:cNvGraphicFramePr>
+              <a:graphicFrameLocks xmlns:a="http://schemas.openxmlformats.org/drawingml/2006/main" noChangeAspect="1"/>
+            </wp:cNvGraphicFramePr>
+            <a:graphic xmlns:a="http://schemas.openxmlformats.org/drawingml/2006/main">
+              <a:graphicData uri="http://schemas.openxmlformats.org/drawingml/2006/picture">
+                <pic:pic xmlns:pic="http://schemas.openxmlformats.org/drawingml/2006/picture">
+                  <pic:nvPicPr>
+                    <pic:cNvPr id="901112504" name="Picture 1" descr="A screen shot of a computer program&#10;&#10;AI-generated content may be incorrect."/>
+                    <pic:cNvPicPr/>
+                  </pic:nvPicPr>
+                  <pic:blipFill>
+                    <a:blip r:embed="rId28"/>
+                    <a:stretch>
+                      <a:fillRect/>
+                    </a:stretch>
+                  </pic:blipFill>
+                  <pic:spPr>
+                    <a:xfrm>
+                      <a:off x="0" y="0"/>
+                      <a:ext cx="5731510" cy="3801110"/>
+                    </a:xfrm>
+                    <a:prstGeom prst="rect">
+                      <a:avLst/>
+                    </a:prstGeom>
+                  </pic:spPr>
+                </pic:pic>
+              </a:graphicData>
+            </a:graphic>
+          </wp:inline>
+        </w:drawing>
+      </w:r>
+    </w:p>
+    <w:p>
+      <w:r>
+        <w:rPr>
+          <w:noProof/>
+        </w:rPr>
+        <w:drawing>
+          <wp:inline distT="0" distB="0" distL="0" distR="0" wp14:anchorId="62E7FB62" wp14:editId="437A506E">
+            <wp:extent cx="5731510" cy="2566035"/>
+            <wp:effectExtent l="0" t="0" r="2540" b="5715"/>
+            <wp:docPr id="1520864977" name="Picture 1" descr="A screen shot of a computer&#10;&#10;AI-generated content may be incorrect."/>
+            <wp:cNvGraphicFramePr>
+              <a:graphicFrameLocks xmlns:a="http://schemas.openxmlformats.org/drawingml/2006/main" noChangeAspect="1"/>
+            </wp:cNvGraphicFramePr>
+            <a:graphic xmlns:a="http://schemas.openxmlformats.org/drawingml/2006/main">
+              <a:graphicData uri="http://schemas.openxmlformats.org/drawingml/2006/picture">
+                <pic:pic xmlns:pic="http://schemas.openxmlformats.org/drawingml/2006/picture">
+                  <pic:nvPicPr>
+                    <pic:cNvPr id="1520864977" name="Picture 1" descr="A screen shot of a computer&#10;&#10;AI-generated content may be incorrect."/>
+                    <pic:cNvPicPr/>
+                  </pic:nvPicPr>
+                  <pic:blipFill>
+                    <a:blip r:embed="rId29"/>
+                    <a:stretch>
+                      <a:fillRect/>
+                    </a:stretch>
+                  </pic:blipFill>
+                  <pic:spPr>
+                    <a:xfrm>
+                      <a:off x="0" y="0"/>
+                      <a:ext cx="5731510" cy="2566035"/>
+                    </a:xfrm>
+                    <a:prstGeom prst="rect">
+                      <a:avLst/>
+                    </a:prstGeom>
+                  </pic:spPr>
+                </pic:pic>
+              </a:graphicData>
+            </a:graphic>
+          </wp:inline>
+        </w:drawing>
       </w:r>
     </w:p>
     <w:p/>
     <w:p/>
-    <w:p/>
     <w:p>
       <w:pPr>
         <w:spacing w:line="278" w:lineRule="auto"/>
@@ -1492,7 +1574,176 @@
         <w:br w:type="page"/>
       </w:r>
     </w:p>
-    <w:p/>
+    <w:p>
+      <w:pPr>
+        <w:pStyle w:val="Heading1"/>
+      </w:pPr>
+      <w:r>
+        <w:lastRenderedPageBreak/>
+        <w:t>8.8 Lab Exercise</w:t>
+      </w:r>
+    </w:p>
+    <w:p>
+      <w:r>
+        <w:drawing>
+          <wp:inline distT="0" distB="0" distL="0" distR="0" wp14:anchorId="447063C9" wp14:editId="528A459D">
+            <wp:extent cx="5731510" cy="2619375"/>
+            <wp:effectExtent l="0" t="0" r="2540" b="9525"/>
+            <wp:docPr id="846149040" name="Picture 1" descr="A cell phone with a screen on it&#10;&#10;AI-generated content may be incorrect."/>
+            <wp:cNvGraphicFramePr>
+              <a:graphicFrameLocks xmlns:a="http://schemas.openxmlformats.org/drawingml/2006/main" noChangeAspect="1"/>
+            </wp:cNvGraphicFramePr>
+            <a:graphic xmlns:a="http://schemas.openxmlformats.org/drawingml/2006/main">
+              <a:graphicData uri="http://schemas.openxmlformats.org/drawingml/2006/picture">
+                <pic:pic xmlns:pic="http://schemas.openxmlformats.org/drawingml/2006/picture">
+                  <pic:nvPicPr>
+                    <pic:cNvPr id="846149040" name="Picture 1" descr="A cell phone with a screen on it&#10;&#10;AI-generated content may be incorrect."/>
+                    <pic:cNvPicPr/>
+                  </pic:nvPicPr>
+                  <pic:blipFill>
+                    <a:blip r:embed="rId30"/>
+                    <a:stretch>
+                      <a:fillRect/>
+                    </a:stretch>
+                  </pic:blipFill>
+                  <pic:spPr>
+                    <a:xfrm>
+                      <a:off x="0" y="0"/>
+                      <a:ext cx="5731510" cy="2619375"/>
+                    </a:xfrm>
+                    <a:prstGeom prst="rect">
+                      <a:avLst/>
+                    </a:prstGeom>
+                  </pic:spPr>
+                </pic:pic>
+              </a:graphicData>
+            </a:graphic>
+          </wp:inline>
+        </w:drawing>
+      </w:r>
+      <w:r>
+        <w:drawing>
+          <wp:inline distT="0" distB="0" distL="0" distR="0" wp14:anchorId="4474B711" wp14:editId="5DD0B5B9">
+            <wp:extent cx="5731510" cy="2587625"/>
+            <wp:effectExtent l="0" t="0" r="2540" b="3175"/>
+            <wp:docPr id="1348860859" name="Picture 1" descr="A screen shot of a cell phone&#10;&#10;AI-generated content may be incorrect."/>
+            <wp:cNvGraphicFramePr>
+              <a:graphicFrameLocks xmlns:a="http://schemas.openxmlformats.org/drawingml/2006/main" noChangeAspect="1"/>
+            </wp:cNvGraphicFramePr>
+            <a:graphic xmlns:a="http://schemas.openxmlformats.org/drawingml/2006/main">
+              <a:graphicData uri="http://schemas.openxmlformats.org/drawingml/2006/picture">
+                <pic:pic xmlns:pic="http://schemas.openxmlformats.org/drawingml/2006/picture">
+                  <pic:nvPicPr>
+                    <pic:cNvPr id="1348860859" name="Picture 1" descr="A screen shot of a cell phone&#10;&#10;AI-generated content may be incorrect."/>
+                    <pic:cNvPicPr/>
+                  </pic:nvPicPr>
+                  <pic:blipFill>
+                    <a:blip r:embed="rId31"/>
+                    <a:stretch>
+                      <a:fillRect/>
+                    </a:stretch>
+                  </pic:blipFill>
+                  <pic:spPr>
+                    <a:xfrm>
+                      <a:off x="0" y="0"/>
+                      <a:ext cx="5731510" cy="2587625"/>
+                    </a:xfrm>
+                    <a:prstGeom prst="rect">
+                      <a:avLst/>
+                    </a:prstGeom>
+                  </pic:spPr>
+                </pic:pic>
+              </a:graphicData>
+            </a:graphic>
+          </wp:inline>
+        </w:drawing>
+      </w:r>
+      <w:r>
+        <w:drawing>
+          <wp:inline distT="0" distB="0" distL="0" distR="0" wp14:anchorId="1B7D7C18" wp14:editId="2F95E6A6">
+            <wp:extent cx="5731510" cy="2523490"/>
+            <wp:effectExtent l="0" t="0" r="2540" b="0"/>
+            <wp:docPr id="981248510" name="Picture 1" descr="A screenshot of a computer&#10;&#10;AI-generated content may be incorrect."/>
+            <wp:cNvGraphicFramePr>
+              <a:graphicFrameLocks xmlns:a="http://schemas.openxmlformats.org/drawingml/2006/main" noChangeAspect="1"/>
+            </wp:cNvGraphicFramePr>
+            <a:graphic xmlns:a="http://schemas.openxmlformats.org/drawingml/2006/main">
+              <a:graphicData uri="http://schemas.openxmlformats.org/drawingml/2006/picture">
+                <pic:pic xmlns:pic="http://schemas.openxmlformats.org/drawingml/2006/picture">
+                  <pic:nvPicPr>
+                    <pic:cNvPr id="981248510" name="Picture 1" descr="A screenshot of a computer&#10;&#10;AI-generated content may be incorrect."/>
+                    <pic:cNvPicPr/>
+                  </pic:nvPicPr>
+                  <pic:blipFill>
+                    <a:blip r:embed="rId32"/>
+                    <a:stretch>
+                      <a:fillRect/>
+                    </a:stretch>
+                  </pic:blipFill>
+                  <pic:spPr>
+                    <a:xfrm>
+                      <a:off x="0" y="0"/>
+                      <a:ext cx="5731510" cy="2523490"/>
+                    </a:xfrm>
+                    <a:prstGeom prst="rect">
+                      <a:avLst/>
+                    </a:prstGeom>
+                  </pic:spPr>
+                </pic:pic>
+              </a:graphicData>
+            </a:graphic>
+          </wp:inline>
+        </w:drawing>
+      </w:r>
+    </w:p>
+    <w:p>
+      <w:pPr>
+        <w:spacing w:line="278" w:lineRule="auto"/>
+      </w:pPr>
+      <w:r>
+        <w:br w:type="page"/>
+      </w:r>
+    </w:p>
+    <w:p>
+      <w:r>
+        <w:lastRenderedPageBreak/>
+        <w:drawing>
+          <wp:inline distT="0" distB="0" distL="0" distR="0" wp14:anchorId="36C8D7FB" wp14:editId="37A19330">
+            <wp:extent cx="5731510" cy="2619375"/>
+            <wp:effectExtent l="0" t="0" r="2540" b="9525"/>
+            <wp:docPr id="1375607746" name="Picture 1" descr="A screenshot of a computer&#10;&#10;AI-generated content may be incorrect."/>
+            <wp:cNvGraphicFramePr>
+              <a:graphicFrameLocks xmlns:a="http://schemas.openxmlformats.org/drawingml/2006/main" noChangeAspect="1"/>
+            </wp:cNvGraphicFramePr>
+            <a:graphic xmlns:a="http://schemas.openxmlformats.org/drawingml/2006/main">
+              <a:graphicData uri="http://schemas.openxmlformats.org/drawingml/2006/picture">
+                <pic:pic xmlns:pic="http://schemas.openxmlformats.org/drawingml/2006/picture">
+                  <pic:nvPicPr>
+                    <pic:cNvPr id="1375607746" name="Picture 1" descr="A screenshot of a computer&#10;&#10;AI-generated content may be incorrect."/>
+                    <pic:cNvPicPr/>
+                  </pic:nvPicPr>
+                  <pic:blipFill>
+                    <a:blip r:embed="rId33"/>
+                    <a:stretch>
+                      <a:fillRect/>
+                    </a:stretch>
+                  </pic:blipFill>
+                  <pic:spPr>
+                    <a:xfrm>
+                      <a:off x="0" y="0"/>
+                      <a:ext cx="5731510" cy="2619375"/>
+                    </a:xfrm>
+                    <a:prstGeom prst="rect">
+                      <a:avLst/>
+                    </a:prstGeom>
+                  </pic:spPr>
+                </pic:pic>
+              </a:graphicData>
+            </a:graphic>
+          </wp:inline>
+        </w:drawing>
+      </w:r>
+    </w:p>
     <w:p/>
     <w:p/>
     <w:p/>

</xml_diff>